<commit_message>
Correction des accents manquants dans le CV (e, e, a, c, etc.)
</commit_message>
<xml_diff>
--- a/CV/AIT AMIR Youssouf Curriculum Vitae.docx
+++ b/CV/AIT AMIR Youssouf Curriculum Vitae.docx
@@ -48,7 +48,7 @@
           <w:sz w:val="22"/>
           <w:szCs w:val="22"/>
         </w:rPr>
-        <w:t xml:space="preserve">Etudiant BTS CIEL — Option B : Electronique et Reseaux</w:t>
+        <w:t xml:space="preserve">Étudiant BTS CIEL — Option B : Électronique et Réseaux</w:t>
       </w:r>
     </w:p>
     <w:tbl>
@@ -144,7 +144,7 @@
                 <w:sz w:val="18"/>
                 <w:szCs w:val="18"/>
               </w:rPr>
-              <w:t xml:space="preserve">Nationalite Francaise</w:t>
+              <w:t xml:space="preserve">Nationalité Française</w:t>
             </w:r>
           </w:p>
         </w:tc>
@@ -193,7 +193,7 @@
           <w:sz w:val="20"/>
           <w:szCs w:val="20"/>
         </w:rPr>
-        <w:t xml:space="preserve">BTS CIEL — Option B : Electronique et Reseaux</w:t>
+        <w:t xml:space="preserve">BTS CIEL — Option B : Électronique et Réseaux</w:t>
       </w:r>
       <w:r>
         <w:t xml:space="preserve">	</w:t>
@@ -238,7 +238,7 @@
           <w:sz w:val="18"/>
           <w:szCs w:val="18"/>
         </w:rPr>
-        <w:t xml:space="preserve">▸  U4 — Etude et conception de produits electroniques</w:t>
+        <w:t xml:space="preserve">▸  U4 — Étude et conception de produits électroniques</w:t>
       </w:r>
     </w:p>
     <w:p>
@@ -253,7 +253,7 @@
           <w:sz w:val="18"/>
           <w:szCs w:val="18"/>
         </w:rPr>
-        <w:t xml:space="preserve">▸  U5 — Mise en oeuvre de reseaux informatiques</w:t>
+        <w:t xml:space="preserve">▸  U5 — Mise en œuvre de réseaux informatiques</w:t>
       </w:r>
     </w:p>
     <w:p>
@@ -268,7 +268,7 @@
           <w:sz w:val="18"/>
           <w:szCs w:val="18"/>
         </w:rPr>
-        <w:t xml:space="preserve">▸  U6 — Realisation et maintenance de produits electroniques et systemes communicants</w:t>
+        <w:t xml:space="preserve">▸  U6 — Réalisation et maintenance de produits électroniques et systèmes communicants</w:t>
       </w:r>
     </w:p>
     <w:p>
@@ -283,7 +283,7 @@
           <w:sz w:val="18"/>
           <w:szCs w:val="18"/>
         </w:rPr>
-        <w:t xml:space="preserve">▸  Tronc commun : Mathematiques, Sciences Physiques, Anglais</w:t>
+        <w:t xml:space="preserve">▸  Tronc commun : Mathématiques, Sciences Physiques, Anglais</w:t>
       </w:r>
     </w:p>
     <w:p>
@@ -317,7 +317,7 @@
           <w:sz w:val="20"/>
           <w:szCs w:val="20"/>
         </w:rPr>
-        <w:t xml:space="preserve">BUT Sciences des Donnees — Reorientation</w:t>
+        <w:t xml:space="preserve">BUT Sciences des Données — Réorientation</w:t>
       </w:r>
       <w:r>
         <w:t xml:space="preserve">	</w:t>
@@ -347,7 +347,7 @@
           <w:sz w:val="18"/>
           <w:szCs w:val="18"/>
         </w:rPr>
-        <w:t xml:space="preserve">Universite de Lille (59)</w:t>
+        <w:t xml:space="preserve">Université de Lille (59)</w:t>
       </w:r>
     </w:p>
     <w:p>
@@ -362,7 +362,7 @@
           <w:sz w:val="18"/>
           <w:szCs w:val="18"/>
         </w:rPr>
-        <w:t xml:space="preserve">▸  Programmation : Python, JavaScript, HTML  •  Bases de donnees : SQL, MySQL</w:t>
+        <w:t xml:space="preserve">▸  Programmation : Python, JavaScript, HTML  •  Bases de données : SQL, MySQL</w:t>
       </w:r>
     </w:p>
     <w:p>
@@ -396,7 +396,7 @@
           <w:sz w:val="20"/>
           <w:szCs w:val="20"/>
         </w:rPr>
-        <w:t xml:space="preserve">Baccalaureat General — Specialites Mathematiques &amp; NSI</w:t>
+        <w:t xml:space="preserve">Baccalauréat Général — Spécialités Mathématiques &amp; NSI</w:t>
       </w:r>
       <w:r>
         <w:t xml:space="preserve">	</w:t>
@@ -426,7 +426,7 @@
           <w:sz w:val="18"/>
           <w:szCs w:val="18"/>
         </w:rPr>
-        <w:t xml:space="preserve">Lycee Faidherbe, Lille (59)</w:t>
+        <w:t xml:space="preserve">Lycée Faidherbe, Lille (59)</w:t>
       </w:r>
     </w:p>
     <w:p>
@@ -460,7 +460,7 @@
           <w:sz w:val="22"/>
           <w:szCs w:val="22"/>
         </w:rPr>
-        <w:t xml:space="preserve">EXPERIENCE PROFESSIONNELLE</w:t>
+        <w:t xml:space="preserve">EXPÉRIENCE PROFESSIONNELLE</w:t>
       </w:r>
     </w:p>
     <w:p>
@@ -479,7 +479,7 @@
           <w:sz w:val="20"/>
           <w:szCs w:val="20"/>
         </w:rPr>
-        <w:t xml:space="preserve">Stage PFMP — Support technique &amp; systemes</w:t>
+        <w:t xml:space="preserve">Stage PFMP — Support technique &amp; systèmes</w:t>
       </w:r>
       <w:r>
         <w:t xml:space="preserve">	</w:t>
@@ -509,7 +509,7 @@
           <w:sz w:val="18"/>
           <w:szCs w:val="18"/>
         </w:rPr>
-        <w:t xml:space="preserve">Konica Minolta Business Solutions France — Saighin-en-Melantois (59)</w:t>
+        <w:t xml:space="preserve">Konica Minolta Business Solutions France — Saighin-en-Mélantois (59)</w:t>
       </w:r>
     </w:p>
     <w:p>
@@ -524,7 +524,7 @@
           <w:sz w:val="18"/>
           <w:szCs w:val="18"/>
         </w:rPr>
-        <w:t xml:space="preserve">▸  Mise en service, configuration et maintenance de solutions d'impression reseau en environnement professionnel</w:t>
+        <w:t xml:space="preserve">▸  Mise en service, configuration et maintenance de solutions d'impression réseau en environnement professionnel</w:t>
       </w:r>
     </w:p>
     <w:p>
@@ -539,7 +539,7 @@
           <w:sz w:val="18"/>
           <w:szCs w:val="18"/>
         </w:rPr>
-        <w:t xml:space="preserve">▸  Gestion de parc, support client, diagnostic de pannes et application des competences reseaux (adressage IP, connexion equipements)</w:t>
+        <w:t xml:space="preserve">▸  Gestion de parc, support client, diagnostic de pannes et application des compétences réseaux (adressage IP, connexion équipements)</w:t>
       </w:r>
     </w:p>
     <w:p>
@@ -574,7 +574,7 @@
           <w:sz w:val="18"/>
           <w:szCs w:val="18"/>
         </w:rPr>
-        <w:t xml:space="preserve">Reseaux : </w:t>
+        <w:t xml:space="preserve">Réseaux : </w:t>
       </w:r>
       <w:r>
         <w:rPr>
@@ -599,16 +599,16 @@
           <w:sz w:val="18"/>
           <w:szCs w:val="18"/>
         </w:rPr>
-        <w:t xml:space="preserve">Electronique : </w:t>
-      </w:r>
-      <w:r>
-        <w:rPr>
-          <w:rFonts w:ascii="Calibri" w:cs="Calibri" w:eastAsia="Calibri" w:hAnsi="Calibri"/>
-          <w:color w:val="2C3E50"/>
-          <w:sz w:val="18"/>
-          <w:szCs w:val="18"/>
-        </w:rPr>
-        <w:t xml:space="preserve">Schemas electroniques  •  Simulation (Proteus)  •  Arduino IDE  •  Cablage / soudure  •  Oscilloscope / multimetre</w:t>
+        <w:t xml:space="preserve">Électronique : </w:t>
+      </w:r>
+      <w:r>
+        <w:rPr>
+          <w:rFonts w:ascii="Calibri" w:cs="Calibri" w:eastAsia="Calibri" w:hAnsi="Calibri"/>
+          <w:color w:val="2C3E50"/>
+          <w:sz w:val="18"/>
+          <w:szCs w:val="18"/>
+        </w:rPr>
+        <w:t xml:space="preserve">Schémas électroniques  •  Simulation (Proteus)  •  Arduino IDE  •  Câblage / soudure  •  Oscilloscope / multimètre</w:t>
       </w:r>
     </w:p>
     <w:p>
@@ -624,16 +624,16 @@
           <w:sz w:val="18"/>
           <w:szCs w:val="18"/>
         </w:rPr>
-        <w:t xml:space="preserve">Cybersecurite : </w:t>
-      </w:r>
-      <w:r>
-        <w:rPr>
-          <w:rFonts w:ascii="Calibri" w:cs="Calibri" w:eastAsia="Calibri" w:hAnsi="Calibri"/>
-          <w:color w:val="2C3E50"/>
-          <w:sz w:val="18"/>
-          <w:szCs w:val="18"/>
-        </w:rPr>
-        <w:t xml:space="preserve">Notions firewall  •  Securisation de reseaux</w:t>
+        <w:t xml:space="preserve">Cybersécurité : </w:t>
+      </w:r>
+      <w:r>
+        <w:rPr>
+          <w:rFonts w:ascii="Calibri" w:cs="Calibri" w:eastAsia="Calibri" w:hAnsi="Calibri"/>
+          <w:color w:val="2C3E50"/>
+          <w:sz w:val="18"/>
+          <w:szCs w:val="18"/>
+        </w:rPr>
+        <w:t xml:space="preserve">Notions firewall  •  Sécurisation de réseaux</w:t>
       </w:r>
     </w:p>
     <w:p>
@@ -771,7 +771,7 @@
           <w:sz w:val="22"/>
           <w:szCs w:val="22"/>
         </w:rPr>
-        <w:t xml:space="preserve">CENTRES D'INTERET</w:t>
+        <w:t xml:space="preserve">CENTRES D'INTÉRÊT</w:t>
       </w:r>
     </w:p>
     <w:p>
@@ -787,7 +787,7 @@
           <w:sz w:val="18"/>
           <w:szCs w:val="18"/>
         </w:rPr>
-        <w:t xml:space="preserve">Tennis en competition</w:t>
+        <w:t xml:space="preserve">Tennis en compétition</w:t>
       </w:r>
       <w:r>
         <w:rPr>
@@ -816,7 +816,7 @@
           <w:sz w:val="18"/>
           <w:szCs w:val="18"/>
         </w:rPr>
-        <w:t xml:space="preserve">  —  Veille informatique &amp; cybersecurite</w:t>
+        <w:t xml:space="preserve">  —  Veille informatique &amp; cybersécurité</w:t>
       </w:r>
     </w:p>
     <w:p>
@@ -832,16 +832,16 @@
           <w:sz w:val="18"/>
           <w:szCs w:val="18"/>
         </w:rPr>
-        <w:t xml:space="preserve">Labs reseaux personnels</w:t>
-      </w:r>
-      <w:r>
-        <w:rPr>
-          <w:rFonts w:ascii="Calibri" w:cs="Calibri" w:eastAsia="Calibri" w:hAnsi="Calibri"/>
-          <w:color w:val="2C3E50"/>
-          <w:sz w:val="18"/>
-          <w:szCs w:val="18"/>
-        </w:rPr>
-        <w:t xml:space="preserve">  —  Commutation/routage Cisco encadre par un expert en cybersecurite</w:t>
+        <w:t xml:space="preserve">Labs réseaux personnels</w:t>
+      </w:r>
+      <w:r>
+        <w:rPr>
+          <w:rFonts w:ascii="Calibri" w:cs="Calibri" w:eastAsia="Calibri" w:hAnsi="Calibri"/>
+          <w:color w:val="2C3E50"/>
+          <w:sz w:val="18"/>
+          <w:szCs w:val="18"/>
+        </w:rPr>
+        <w:t xml:space="preserve">  —  Commutation/routage Cisco encadré par un expert en cybersécurité</w:t>
       </w:r>
     </w:p>
     <w:sectPr>

</xml_diff>